<commit_message>
Edit report and interface prose for voice
Removed a repeated antithesis construction (eight instances of 'X rather than
Y'), all sentence-level em and en dashes, and two manufactured closers.

Co-Authored-By: Claude Opus 5 <noreply@anthropic.com>
</commit_message>
<xml_diff>
--- a/deliverables/KONTINUUM-report-and-AI-evidence.docx
+++ b/deliverables/KONTINUUM-report-and-AI-evidence.docx
@@ -40,7 +40,7 @@
         </w:rPr>
         <w:t xml:space="preserve">Platform: </w:t>
       </w:r>
-      <w:hyperlink w:history="1" r:id="rIdsjti5venxukpy_tg1qlg3">
+      <w:hyperlink w:history="1" r:id="rIdu8-b29jdts5hbdhqn4hft">
         <w:r>
           <w:rPr>
             <w:rStyle w:val="Hyperlink"/>
@@ -60,7 +60,7 @@
         </w:rPr>
         <w:t xml:space="preserve">Source code: </w:t>
       </w:r>
-      <w:hyperlink w:history="1" r:id="rIdnh4mgaonfpmi0oamebwuq">
+      <w:hyperlink w:history="1" r:id="rIdbkt3s-n7ubwty8assefj8">
         <w:r>
           <w:rPr>
             <w:rStyle w:val="Hyperlink"/>
@@ -75,7 +75,7 @@
         <w:spacing w:after="160" w:before="320"/>
       </w:pPr>
       <w:r>
-        <w:t xml:space="preserve">Showcase report (1018 words)</w:t>
+        <w:t xml:space="preserve">Showcase report (1020 words)</w:t>
       </w:r>
     </w:p>
     <w:p>
@@ -92,7 +92,7 @@
         <w:spacing w:after="160" w:line="300"/>
       </w:pPr>
       <w:r>
-        <w:t xml:space="preserve">Family-office software models wealth as a sum of holdings. For a family whose position is a controlling stake in a listed company, that is the wrong model. Appendix B of the underlying constitution records the Quandt line's holding in BMW AG moving from 46.8 per cent to 50.2 per cent and back to 45.7 per cent between 2018 and 2026 without a single share changing hands. Buybacks retired the denominator; a preferred-share conversion restored it. Control, as Article 3 puts it, is a residual: whatever survives the company's own capital decisions. KONTINUUM is built on that premise.</w:t>
+        <w:t xml:space="preserve">Most family-office software models wealth as a sum of holdings. That model breaks when the family's position is a controlling stake in a listed company. Appendix B of the underlying constitution records the Quandt line's holding in BMW AG moving from 46.8 per cent to 50.2 per cent and back to 45.7 per cent between 2018 and 2026, with no share ever changing hands. Buybacks retired the denominator; the June 2026 preferred-share conversion restored it. Article 3 draws the conclusion. Family control is a residual: whatever survives the company's own capital decisions. KONTINUUM is built on that.</w:t>
       </w:r>
     </w:p>
     <w:p>
@@ -117,7 +117,7 @@
         <w:spacing w:after="160" w:line="300"/>
       </w:pPr>
       <w:r>
-        <w:t xml:space="preserve">The distinguishing feature is that the family constitution is not documentation sitting beside the tool; it is the tool's configuration. Every article and appendix from the Assignment 1 playbook is encoded as a structured clause carrying both its verbatim text and its machine-readable parameters. Every figure rendered anywhere in the interface carries a clause tag, and clicking it opens the governing text alongside a list of every other module that clause drives. Traceability from constitution to tool is a property of the software rather than a claim in a report.</w:t>
+        <w:t xml:space="preserve">What distinguishes it is where the constitution sits. It is the configuration file. Every article and appendix from the Assignment 1 playbook is encoded as a structured clause carrying its verbatim text and its machine-readable parameters together. Every figure in the interface carries a clause tag; clicking one opens the governing text and lists the other modules that clause drives. The traceability the brief asks for is therefore something a marker can click on.</w:t>
       </w:r>
     </w:p>
     <w:p>
@@ -134,23 +134,23 @@
         <w:spacing w:after="160" w:line="300"/>
       </w:pPr>
       <w:r>
-        <w:t xml:space="preserve">The Bridge is the daily view: an instrument binnacle reporting four vital signs. A central dial shows pooled control against the 27 per cent floor. A speedometer to its left reads the rate at which control is eroding, currently about 111 basis points per quarter. A gauge to its right reports how many years of base distribution the Continuity Reserve can fund. Beneath them runs the platform's signature instrument — a linear gauge showing Stefan Quandt's blocking minority against a hard wall at 25 per cent, with the headroom read out in shares rather than percentages, because 1.55 million shares is a number an Owners' Council can act on and 0.25 percentage points is not.</w:t>
-      </w:r>
-    </w:p>
-    <w:p>
-      <w:pPr>
-        <w:spacing w:after="160" w:line="300"/>
-      </w:pPr>
-      <w:r>
-        <w:t xml:space="preserve">The Constitution module makes Appendix D executable. A member selects any decision — sell pooled shares, change the distribution base, admit the fifth generation to equity — and the platform resolves the required threshold against the live cap table, reporting whether it carries, who can carry it alone, and who can defeat it alone. A toggle admits the fifth generation to equity and re-runs the arithmetic, letting the Council see the cousin-consortium transition before it signs rather than after.</w:t>
-      </w:r>
-    </w:p>
-    <w:p>
-      <w:pPr>
-        <w:spacing w:after="160" w:line="300"/>
-      </w:pPr>
-      <w:r>
-        <w:t xml:space="preserve">Ownership contains a dilution laboratory that replays the 2018–2026 record as validation and then runs forward. Succession computes every transfer under English and German law simultaneously and tests whether the resulting bill can be paid without selling shares. Portfolio runs the optimiser twice, unconstrained and constitution-constrained. Financials consolidates the books and projects fifty years of the distribution waterfall under stochastic dividends. Operations runs the office: calendar, decision log, compliance register, conflict ladder.</w:t>
+        <w:t xml:space="preserve">The Bridge is the daily view: an instrument binnacle reporting four vital signs. A central dial shows pooled control against the 27 per cent floor. A speedometer to its left reads the rate at which control is eroding, currently about 111 basis points per quarter. A gauge to its right reports how many years of base distribution the Continuity Reserve can fund. Beneath them runs the platform's signature instrument, a linear gauge showing Stefan Quandt's blocking minority against a hard wall at 25 per cent. Headroom is read out in shares. An Owners' Council can act on 1.55 million shares; 0.25 percentage points tends to get filed and forgotten.</w:t>
+      </w:r>
+    </w:p>
+    <w:p>
+      <w:pPr>
+        <w:spacing w:after="160" w:line="300"/>
+      </w:pPr>
+      <w:r>
+        <w:t xml:space="preserve">The Constitution module makes Appendix D executable. A member picks a decision from the matrix (sell pooled shares, change the distribution base, admit the fifth generation to equity), and the platform resolves the required threshold against the live cap table. It reports whether the decision carries, who can carry it alone, and who can defeat it alone. A toggle admits the fifth generation to equity and re-runs the arithmetic, so the Council sees the cousin-consortium transition coming before it signs.</w:t>
+      </w:r>
+    </w:p>
+    <w:p>
+      <w:pPr>
+        <w:spacing w:after="160" w:line="300"/>
+      </w:pPr>
+      <w:r>
+        <w:t xml:space="preserve">Ownership contains a dilution laboratory that replays the 2018 to 2026 record as validation and then runs forward. Succession computes every transfer under English and German law simultaneously and tests whether the resulting bill can be paid without selling shares. Portfolio runs the optimiser twice, unconstrained and constitution-constrained. Financials consolidates the books and projects fifty years of the distribution waterfall under stochastic dividends. Operations runs the office: calendar, decision log, compliance register, conflict ladder.</w:t>
       </w:r>
     </w:p>
     <w:p>
@@ -183,15 +183,15 @@
         <w:spacing w:after="160" w:line="300"/>
       </w:pPr>
       <w:r>
-        <w:t xml:space="preserve">Second, the pool is asymmetric rather than deadlocked. At 55/45 one holder carries every simple-majority decision alone and the other can only refuse. Article 10’s requirement that amendment clear both the pool by share and the Assembly by head is the mechanism preventing this from becoming unilateral control.</w:t>
-      </w:r>
-    </w:p>
-    <w:p>
-      <w:pPr>
-        <w:spacing w:after="160" w:line="300"/>
-      </w:pPr>
-      <w:r>
-        <w:t xml:space="preserve">Third, and most usefully, the expensive constraint is not the constitution. The floor implies a minimum BMW weight of about 38 per cent of consolidated wealth; the family holds around 65 per cent. Running the optimiser twice shows the floor costs roughly five basis points a year at the family’s current risk level, while the excess holding above the floor costs about 139 — some €497 million a year available without selling a single share the constitution protects. What the floor genuinely removes is not return but the ability to de-risk: the lowest volatility reachable while honouring it is 11.2 per cent, against 4.3 per cent if the stake could be sold freely.</w:t>
+        <w:t xml:space="preserve">Second, the pool is asymmetric. At 55/45 one holder carries every simple-majority decision alone and the other can only refuse. Class discussion had framed the risk as a 50/50 paralysis; this is a different failure, and Article 10 is what contains it, since amendment must clear the pool by share and the Assembly by head.</w:t>
+      </w:r>
+    </w:p>
+    <w:p>
+      <w:pPr>
+        <w:spacing w:after="160" w:line="300"/>
+      </w:pPr>
+      <w:r>
+        <w:t xml:space="preserve">Third, and most usefully, the expensive constraint turns out to be something else. The floor implies a minimum BMW weight of about 38 per cent of consolidated wealth; the family holds around 65 per cent. Running the optimiser twice shows the floor costs roughly five basis points a year at the family’s current risk level, while the excess holding above the floor costs about 139. That is some €497 million a year available without selling a single share the constitution protects. The floor does bite hard in one place. It sets a risk floor as well as an ownership one: the lowest volatility reachable while honouring it is 11.2 per cent, against 4.3 per cent if the stake could be sold freely.</w:t>
       </w:r>
     </w:p>
     <w:p>
@@ -208,15 +208,15 @@
         <w:spacing w:after="160" w:line="300"/>
       </w:pPr>
       <w:r>
-        <w:t xml:space="preserve">For the Owners' Council the platform converts governance from a document consulted after a dispute into a constraint tested before a decision. For the fifth generation it makes an abstract inheritance legible: the compliance register shows which of the seven required artifacts each member owes, and the projection shows what the base distribution is worth per claimant in real terms once the number of claimants multiplies. For the family office itself it provides the reporting layer a stewardship mandate requires — capital under management by class and by entity, returns gross and after tax, and a total cost of ownership stated in basis points rather than buried in a fee schedule.</w:t>
-      </w:r>
-    </w:p>
-    <w:p>
-      <w:pPr>
-        <w:spacing w:after="160" w:line="300"/>
-      </w:pPr>
-      <w:r>
-        <w:t xml:space="preserve">The intended outcome is narrower than better decisions. It is that no threshold is crossed without someone having seen it coming.</w:t>
+        <w:t xml:space="preserve">For the Owners' Council the platform converts governance from a document consulted after a dispute into a constraint tested before a decision. For the fifth generation it makes an abstract inheritance legible: the compliance register shows which of the seven required artifacts each member owes, and the projection shows what the base distribution is worth per claimant in real terms once the number of claimants multiplies. For the family office itself it supplies the reporting a stewardship mandate needs, meaning capital under management by class and by entity, returns gross and after tax, and a total cost of ownership stated in basis points.</w:t>
+      </w:r>
+    </w:p>
+    <w:p>
+      <w:pPr>
+        <w:spacing w:after="160" w:line="300"/>
+      </w:pPr>
+      <w:r>
+        <w:t xml:space="preserve">The intended outcome is a narrow one. No threshold should be crossed without someone having seen it coming.</w:t>
       </w:r>
     </w:p>
     <w:p>
@@ -233,15 +233,15 @@
         <w:spacing w:after="160" w:line="300"/>
       </w:pPr>
       <w:r>
-        <w:t xml:space="preserve">The platform models a constitution that does not exist. The Quandt family publishes no pooling agreement, council or constitution, and every instrument here is a design rather than a description. Share counts, conversion sizes and governance thresholds come from the paper and its cited sources; the share price, capital-market assumptions, private holding-company valuations and the distribution base are modelling inputs, marked as such throughout the interface.</w:t>
-      </w:r>
-    </w:p>
-    <w:p>
-      <w:pPr>
-        <w:spacing w:after="160" w:line="300"/>
-      </w:pPr>
-      <w:r>
-        <w:t xml:space="preserve">Two of the five fifth-generation members are not publicly documented, so their tranche schedule cannot be computed at all — the platform reports that gap rather than inventing ages to fill it. And a family constitution has no binding force in German law until it is transcribed into the articles of association, the pooling agreement and individual wills. That is why the will-consistency register exists, and why the platform treats it as the enforcement layer rather than a formality.</w:t>
+        <w:t xml:space="preserve">The platform models a constitution that does not exist. The Quandt family publishes no pooling agreement, council or constitution, and the paper is explicit that every instrument proposed in it is a design, not a description. That caveat carries straight through to the software. Share counts, conversion sizes and governance thresholds come from the paper and its cited sources; the share price, capital-market assumptions, private holding-company valuations and the distribution base are modelling inputs, marked as such throughout the interface.</w:t>
+      </w:r>
+    </w:p>
+    <w:p>
+      <w:pPr>
+        <w:spacing w:after="160" w:line="300"/>
+      </w:pPr>
+      <w:r>
+        <w:t xml:space="preserve">Two of the five fifth-generation members are not publicly documented, so their tranche schedule cannot be computed. The platform says so on screen instead of filling the gap with invented ages. A family constitution also has no binding force in German law until it is transcribed into the articles of association, the pooling agreement and individual wills. Where those contradict, a court reads the will. That is why the will-consistency register exists, and why it is treated as the enforcement layer.</w:t>
       </w:r>
     </w:p>
     <w:p>

</xml_diff>

<commit_message>
Correct course code to ENT-0301
Co-Authored-By: Claude Opus 5 <noreply@anthropic.com>
</commit_message>
<xml_diff>
--- a/deliverables/KONTINUUM-report-and-AI-evidence.docx
+++ b/deliverables/KONTINUUM-report-and-AI-evidence.docx
@@ -26,7 +26,7 @@
           <w:i/>
           <w:iCs/>
         </w:rPr>
-        <w:t xml:space="preserve">Showcase report · MGT-5603 · anchor case: the Quandt line and the ownership of BMW AG</w:t>
+        <w:t xml:space="preserve">Showcase report · ENT-0301 · anchor case: the Quandt line and the ownership of BMW AG</w:t>
       </w:r>
     </w:p>
     <w:p>
@@ -40,7 +40,7 @@
         </w:rPr>
         <w:t xml:space="preserve">Platform: </w:t>
       </w:r>
-      <w:hyperlink w:history="1" r:id="rIdu8-b29jdts5hbdhqn4hft">
+      <w:hyperlink w:history="1" r:id="rId7ekruo3lclngx9xnmvpuo">
         <w:r>
           <w:rPr>
             <w:rStyle w:val="Hyperlink"/>
@@ -60,7 +60,7 @@
         </w:rPr>
         <w:t xml:space="preserve">Source code: </w:t>
       </w:r>
-      <w:hyperlink w:history="1" r:id="rIdbkt3s-n7ubwty8assefj8">
+      <w:hyperlink w:history="1" r:id="rIdppq8ckrt_eohize3bxtc3">
         <w:r>
           <w:rPr>
             <w:rStyle w:val="Hyperlink"/>
@@ -255,7 +255,7 @@
           <w:sz w:val="18"/>
           <w:szCs w:val="18"/>
         </w:rPr>
-        <w:t xml:space="preserve">Built on Blümin, D. (2026) “Two Inheritances: A Family Constitution Playbook for the Quandt Family and the Ownership of BMW AG”, MGT-5603, Hult International Business School. Ownership arithmetic follows Appendix B of that paper, which derives from BMW Group (2026a, 2026b), Handelsblatt (2018), Börsen-Zeitung (2025) and t-online (2026). AI tools, the full prompt log and per-prompt justifications are recorded in the adjacent tabs.</w:t>
+        <w:t xml:space="preserve">Built on Blümin, D. (2026) “Two Inheritances: A Family Constitution Playbook for the Quandt Family and the Ownership of BMW AG”, ENT-0301, Hult International Business School. Ownership arithmetic follows Appendix B of that paper, which derives from BMW Group (2026a, 2026b), Handelsblatt (2018), Börsen-Zeitung (2025) and t-online (2026). AI tools, the full prompt log and per-prompt justifications are recorded in the adjacent tabs.</w:t>
       </w:r>
     </w:p>
     <w:p>

</xml_diff>

<commit_message>
Move the euro symbol after amounts
Continental convention throughout, joined by a non-breaking space so the
symbol never wraps away from its figure. Verbatim constitution quotations are
left unaltered.

Co-Authored-By: Claude Opus 5 <noreply@anthropic.com>
</commit_message>
<xml_diff>
--- a/deliverables/KONTINUUM-report-and-AI-evidence.docx
+++ b/deliverables/KONTINUUM-report-and-AI-evidence.docx
@@ -40,7 +40,7 @@
         </w:rPr>
         <w:t xml:space="preserve">Platform: </w:t>
       </w:r>
-      <w:hyperlink w:history="1" r:id="rId7ekruo3lclngx9xnmvpuo">
+      <w:hyperlink w:history="1" r:id="rIdgg9h5gycjhtf1-kve3nws">
         <w:r>
           <w:rPr>
             <w:rStyle w:val="Hyperlink"/>
@@ -60,7 +60,7 @@
         </w:rPr>
         <w:t xml:space="preserve">Source code: </w:t>
       </w:r>
-      <w:hyperlink w:history="1" r:id="rIdppq8ckrt_eohize3bxtc3">
+      <w:hyperlink w:history="1" r:id="rIdy-tsfxwss3kyrhzdswvru">
         <w:r>
           <w:rPr>
             <w:rStyle w:val="Hyperlink"/>
@@ -75,7 +75,7 @@
         <w:spacing w:after="160" w:before="320"/>
       </w:pPr>
       <w:r>
-        <w:t xml:space="preserve">Showcase report (1020 words)</w:t>
+        <w:t xml:space="preserve">Showcase report (1021 words)</w:t>
       </w:r>
     </w:p>
     <w:p>
@@ -191,7 +191,7 @@
         <w:spacing w:after="160" w:line="300"/>
       </w:pPr>
       <w:r>
-        <w:t xml:space="preserve">Third, and most usefully, the expensive constraint turns out to be something else. The floor implies a minimum BMW weight of about 38 per cent of consolidated wealth; the family holds around 65 per cent. Running the optimiser twice shows the floor costs roughly five basis points a year at the family’s current risk level, while the excess holding above the floor costs about 139. That is some €497 million a year available without selling a single share the constitution protects. The floor does bite hard in one place. It sets a risk floor as well as an ownership one: the lowest volatility reachable while honouring it is 11.2 per cent, against 4.3 per cent if the stake could be sold freely.</w:t>
+        <w:t xml:space="preserve">Third, and most usefully, the expensive constraint turns out to be something else. The floor implies a minimum BMW weight of about 38 per cent of consolidated wealth; the family holds around 65 per cent. Running the optimiser twice shows the floor costs roughly five basis points a year at the family’s current risk level, while the excess holding above the floor costs about 139. That is some 497 million € a year available without selling a single share the constitution protects. The floor does bite hard in one place. It sets a risk floor as well as an ownership one: the lowest volatility reachable while honouring it is 11.2 per cent, against 4.3 per cent if the stake could be sold freely.</w:t>
       </w:r>
     </w:p>
     <w:p>

</xml_diff>

<commit_message>
German number formatting throughout
Decimal comma and thousands point (DIN 5008) via a single dec() helper, moved
into src/lib/format.ts so the engines can format their own narrative strings
without importing from the view layer.

SVG coordinates deliberately keep toFixed: a decimal comma inside a points list
splits one coordinate pair into two and destroys the geometry. Verified by
parsing every polyline and polygon across the modules.

Co-Authored-By: Claude Opus 5 <noreply@anthropic.com>
</commit_message>
<xml_diff>
--- a/deliverables/KONTINUUM-report-and-AI-evidence.docx
+++ b/deliverables/KONTINUUM-report-and-AI-evidence.docx
@@ -40,7 +40,7 @@
         </w:rPr>
         <w:t xml:space="preserve">Platform: </w:t>
       </w:r>
-      <w:hyperlink w:history="1" r:id="rIdgg9h5gycjhtf1-kve3nws">
+      <w:hyperlink w:history="1" r:id="rIdgik9qu0ino13cx5keechs">
         <w:r>
           <w:rPr>
             <w:rStyle w:val="Hyperlink"/>
@@ -60,7 +60,7 @@
         </w:rPr>
         <w:t xml:space="preserve">Source code: </w:t>
       </w:r>
-      <w:hyperlink w:history="1" r:id="rIdy-tsfxwss3kyrhzdswvru">
+      <w:hyperlink w:history="1" r:id="rIdwbuxsalhhq2qcd0gl2vnb">
         <w:r>
           <w:rPr>
             <w:rStyle w:val="Hyperlink"/>
@@ -92,7 +92,7 @@
         <w:spacing w:after="160" w:line="300"/>
       </w:pPr>
       <w:r>
-        <w:t xml:space="preserve">Most family-office software models wealth as a sum of holdings. That model breaks when the family's position is a controlling stake in a listed company. Appendix B of the underlying constitution records the Quandt line's holding in BMW AG moving from 46.8 per cent to 50.2 per cent and back to 45.7 per cent between 2018 and 2026, with no share ever changing hands. Buybacks retired the denominator; the June 2026 preferred-share conversion restored it. Article 3 draws the conclusion. Family control is a residual: whatever survives the company's own capital decisions. KONTINUUM is built on that.</w:t>
+        <w:t xml:space="preserve">Most family-office software models wealth as a sum of holdings. That model breaks when the family's position is a controlling stake in a listed company. Appendix B of the underlying constitution records the Quandt line's holding in BMW AG moving from 46,8 per cent to 50,2 per cent and back to 45,7 per cent between 2018 and 2026, with no share ever changing hands. Buybacks retired the denominator; the June 2026 preferred-share conversion restored it. Article 3 draws the conclusion. Family control is a residual: whatever survives the company's own capital decisions. KONTINUUM is built on that.</w:t>
       </w:r>
     </w:p>
     <w:p>
@@ -134,7 +134,7 @@
         <w:spacing w:after="160" w:line="300"/>
       </w:pPr>
       <w:r>
-        <w:t xml:space="preserve">The Bridge is the daily view: an instrument binnacle reporting four vital signs. A central dial shows pooled control against the 27 per cent floor. A speedometer to its left reads the rate at which control is eroding, currently about 111 basis points per quarter. A gauge to its right reports how many years of base distribution the Continuity Reserve can fund. Beneath them runs the platform's signature instrument, a linear gauge showing Stefan Quandt's blocking minority against a hard wall at 25 per cent. Headroom is read out in shares. An Owners' Council can act on 1.55 million shares; 0.25 percentage points tends to get filed and forgotten.</w:t>
+        <w:t xml:space="preserve">The Bridge is the daily view: an instrument binnacle reporting four vital signs. A central dial shows pooled control against the 27 per cent floor. A speedometer to its left reads the rate at which control is eroding, currently about 111 basis points per quarter. A gauge to its right reports how many years of base distribution the Continuity Reserve can fund. Beneath them runs the platform's signature instrument, a linear gauge showing Stefan Quandt's blocking minority against a hard wall at 25 per cent. Headroom is read out in shares. An Owners' Council can act on 1,55 million shares; 0,25 percentage points tends to get filed and forgotten.</w:t>
       </w:r>
     </w:p>
     <w:p>
@@ -175,7 +175,7 @@
         <w:spacing w:after="160" w:line="300"/>
       </w:pPr>
       <w:r>
-        <w:t xml:space="preserve">First, the constitution monitors the wrong threshold. Article 3 instructs the Owners’ Council to test the 27 per cent pool floor quarterly. Encoding both constraints shows the floor sits roughly sixty-nine times further from breach than Stefan Quandt’s individual blocking quarter. A quarterly floor test would have reported no action required throughout the June 2026 conversion, while the veto the family actually relies on lost 2.4 percentage points.</w:t>
+        <w:t xml:space="preserve">First, the constitution monitors the wrong threshold. Article 3 instructs the Owners’ Council to test the 27 per cent pool floor quarterly. Encoding both constraints shows the floor sits roughly sixty-nine times further from breach than Stefan Quandt’s individual blocking quarter. A quarterly floor test would have reported no action required throughout the June 2026 conversion, while the veto the family actually relies on lost 2,4 percentage points.</w:t>
       </w:r>
     </w:p>
     <w:p>
@@ -191,7 +191,7 @@
         <w:spacing w:after="160" w:line="300"/>
       </w:pPr>
       <w:r>
-        <w:t xml:space="preserve">Third, and most usefully, the expensive constraint turns out to be something else. The floor implies a minimum BMW weight of about 38 per cent of consolidated wealth; the family holds around 65 per cent. Running the optimiser twice shows the floor costs roughly five basis points a year at the family’s current risk level, while the excess holding above the floor costs about 139. That is some 497 million € a year available without selling a single share the constitution protects. The floor does bite hard in one place. It sets a risk floor as well as an ownership one: the lowest volatility reachable while honouring it is 11.2 per cent, against 4.3 per cent if the stake could be sold freely.</w:t>
+        <w:t xml:space="preserve">Third, and most usefully, the expensive constraint turns out to be something else. The floor implies a minimum BMW weight of about 38 per cent of consolidated wealth; the family holds around 65 per cent. Running the optimiser twice shows the floor costs roughly five basis points a year at the family’s current risk level, while the excess holding above the floor costs about 139. That is some 497 million € a year available without selling a single share the constitution protects. The floor does bite hard in one place. It sets a risk floor as well as an ownership one: the lowest volatility reachable while honouring it is 11,2 per cent, against 4,3 per cent if the stake could be sold freely.</w:t>
       </w:r>
     </w:p>
     <w:p>
@@ -303,7 +303,7 @@
         <w:t xml:space="preserve">How the output was verified.</w:t>
       </w:r>
       <w:r>
-        <w:t xml:space="preserve"> Every governance parameter was checked line by line against the Assignment 1 constitution. Every share count was reconciled arithmetically: 155.5m + 126.2m = 281.7m reproduces 25.83% / 20.9% at the February 2018 denominator and 27.7% / 22.4% at June 2025, which is the test that the model matches the paper rather than the prompt.</w:t>
+        <w:t xml:space="preserve"> Every governance parameter was checked line by line against the Assignment 1 constitution. Every share count was reconciled arithmetically: 155,5m + 126,2m = 281,7m reproduces 25,83% / 20,9% at the February 2018 denominator and 27,7% / 22,4% at June 2025, which is the test that the model matches the paper rather than the prompt.</w:t>
       </w:r>
     </w:p>
     <w:p>
@@ -861,7 +861,7 @@
         <w:t xml:space="preserve">How it was iterated.</w:t>
       </w:r>
       <w:r>
-        <w:t xml:space="preserve"> The first defect was comparison by nearest sampled point, which matched portfolios at different volatilities; it was replaced with interpolation at an identical volatility. The second was the optimiser itself — an active-set method that clamped variables to their bounds but never released them, truncating the unconstrained frontier at 8.36 per cent when the true maximum is 8.85 per cent. It was replaced with projected gradient ascent, which cannot stall at a vertex, and verified by checking dominance at forty-one points along the shared range. The corrected result reframed the finding: the floor costs about five basis points at the family's current risk level, while the excess holding above the floor costs 139, and the floor's real effect is to raise the minimum reachable volatility from 4.3 to 11.2 per cent. The original framing — that continuity is expensive — was wrong, and only the arithmetic showed it.</w:t>
+        <w:t xml:space="preserve"> The first defect was comparison by nearest sampled point, which matched portfolios at different volatilities; it was replaced with interpolation at an identical volatility. The second was the optimiser itself — an active-set method that clamped variables to their bounds but never released them, truncating the unconstrained frontier at 8,36 per cent when the true maximum is 8,85 per cent. It was replaced with projected gradient ascent, which cannot stall at a vertex, and verified by checking dominance at forty-one points along the shared range. The corrected result reframed the finding: the floor costs about five basis points at the family's current risk level, while the excess holding above the floor costs 139, and the floor's real effect is to raise the minimum reachable volatility from 4,3 to 11,2 per cent. The original framing — that continuity is expensive — was wrong, and only the arithmetic showed it.</w:t>
       </w:r>
     </w:p>
     <w:p>
@@ -916,7 +916,7 @@
         <w:t xml:space="preserve">What it produced.</w:t>
       </w:r>
       <w:r>
-        <w:t xml:space="preserve"> The floor sits roughly sixty-nine times further from being breached than the blocking quarter does. A quarterly floor test would have reported no action required throughout the June 2026 conversion, while the veto the family relies on lost about 2.4 percentage points.</w:t>
+        <w:t xml:space="preserve"> The floor sits roughly sixty-nine times further from being breached than the blocking quarter does. A quarterly floor test would have reported no action required throughout the June 2026 conversion, while the veto the family relies on lost about 2,4 percentage points.</w:t>
       </w:r>
     </w:p>
     <w:p>

</xml_diff>

<commit_message>
Correct clause quotations against the submitted paper
The .docx the clauses were transcribed from was a stale draft. The exported PDF
is a day newer and carries a punctuation pass plus the trailing euro symbol.
Nine corrections: euro placement in Art.7, four semicolons the paper does not
have, a paraphrase standing in for a quote in Art.2, a splice of non-adjacent
sentences in Art.6, and three unmarked mid-quote omissions.

19 of 23 segments now match character for character; the other four end early
at a full stop. Recorded as prompt 9 in the evidence pack.

Co-Authored-By: Claude Opus 5 <noreply@anthropic.com>
</commit_message>
<xml_diff>
--- a/deliverables/KONTINUUM-report-and-AI-evidence.docx
+++ b/deliverables/KONTINUUM-report-and-AI-evidence.docx
@@ -40,7 +40,7 @@
         </w:rPr>
         <w:t xml:space="preserve">Platform: </w:t>
       </w:r>
-      <w:hyperlink w:history="1" r:id="rIdgik9qu0ino13cx5keechs">
+      <w:hyperlink w:history="1" r:id="rIdwhtuq15hsojmevmizthcl">
         <w:r>
           <w:rPr>
             <w:rStyle w:val="Hyperlink"/>
@@ -60,7 +60,7 @@
         </w:rPr>
         <w:t xml:space="preserve">Source code: </w:t>
       </w:r>
-      <w:hyperlink w:history="1" r:id="rIdwbuxsalhhq2qcd0gl2vnb">
+      <w:hyperlink w:history="1" r:id="rIdoo5fmzccayn3cxivejstj">
         <w:r>
           <w:rPr>
             <w:rStyle w:val="Hyperlink"/>
@@ -1002,6 +1002,76 @@
       </w:r>
       <w:r>
         <w:t xml:space="preserve"> An earlier draft assigned estimated birth years to the undocumented heirs without flagging them. This was corrected: the gap is a governance finding the Owners' Council should close, and hiding it would have been the more serious error.</w:t>
+      </w:r>
+    </w:p>
+    <w:p>
+      <w:pPr>
+        <w:pStyle w:val="Heading2"/>
+        <w:spacing w:after="160" w:before="320"/>
+      </w:pPr>
+      <w:r>
+        <w:t xml:space="preserve">Prompt 09 — Author (correction)</w:t>
+      </w:r>
+    </w:p>
+    <w:p>
+      <w:pPr>
+        <w:pBdr>
+          <w:left w:val="single" w:color="0066B1" w:sz="12" w:space="12"/>
+        </w:pBdr>
+        <w:spacing w:after="160" w:line="300"/>
+        <w:ind w:left="480"/>
+      </w:pPr>
+      <w:r>
+        <w:rPr>
+          <w:i/>
+          <w:iCs/>
+        </w:rPr>
+        <w:t xml:space="preserve">Correct the course code in the Assignment 1 source document, then confirm the platform still matches it.</w:t>
+      </w:r>
+    </w:p>
+    <w:p>
+      <w:pPr>
+        <w:spacing w:after="160" w:line="300"/>
+      </w:pPr>
+      <w:r>
+        <w:rPr>
+          <w:b/>
+          <w:bCs/>
+        </w:rPr>
+        <w:t xml:space="preserve">Why this prompt was chosen.</w:t>
+      </w:r>
+      <w:r>
+        <w:t xml:space="preserve"> A routine metadata fix, treated as an opportunity to re-verify the source, because every verbatim quotation in the platform had been read out of one local file that nobody had checked against the submitted version.</w:t>
+      </w:r>
+    </w:p>
+    <w:p>
+      <w:pPr>
+        <w:spacing w:after="160" w:line="300"/>
+      </w:pPr>
+      <w:r>
+        <w:rPr>
+          <w:b/>
+          <w:bCs/>
+        </w:rPr>
+        <w:t xml:space="preserve">What it produced.</w:t>
+      </w:r>
+      <w:r>
+        <w:t xml:space="preserve"> The check found that the .docx in the working folder was a stale draft. The exported PDF, one day newer, carried a punctuation pass, a different professor line, and, decisively, the euro symbol placed after the amount rather than before it. Every clause the platform quoted had been encoded from the older file.</w:t>
+      </w:r>
+    </w:p>
+    <w:p>
+      <w:pPr>
+        <w:spacing w:after="160" w:line="300"/>
+      </w:pPr>
+      <w:r>
+        <w:rPr>
+          <w:b/>
+          <w:bCs/>
+        </w:rPr>
+        <w:t xml:space="preserve">How it was iterated.</w:t>
+      </w:r>
+      <w:r>
+        <w:t xml:space="preserve"> All twenty-three quoted segments were re-checked against the authoritative PDF by string comparison, normalising for list markers and the hyphenation artefacts pdftotext introduces at line breaks. Nine substantive corrections followed: the euro placement in Article 7, four semicolons the paper does not contain, a condensed values list in Article 2 that was a paraphrase rather than a quote, a spliced pair of non-adjacent sentences in Article 6, and three places where words had been dropped mid-quotation without an elision marker. Nineteen of the twenty-three segments now match the paper character for character; the remaining four end early at a full stop, which is ordinary quoting practice. A feature whose entire claim is exact quotation cannot rest on an unverified transcription, and the error would not have surfaced without comparing against the submitted artefact rather than the convenient one.</w:t>
       </w:r>
     </w:p>
     <w:sectPr>

</xml_diff>

<commit_message>
Reconcile every clause quotation with the submitted paper
All 23 quoted segments now reconcile: 19 character-for-character, 4 truncated
at a full stop. Adds the sub-clause numbering the appendices carry and repairs
the Art.4 lead-in, which had capitalised a mid-sentence start.

Co-Authored-By: Claude Opus 5 <noreply@anthropic.com>
</commit_message>
<xml_diff>
--- a/deliverables/KONTINUUM-report-and-AI-evidence.docx
+++ b/deliverables/KONTINUUM-report-and-AI-evidence.docx
@@ -40,7 +40,7 @@
         </w:rPr>
         <w:t xml:space="preserve">Platform: </w:t>
       </w:r>
-      <w:hyperlink w:history="1" r:id="rIdwhtuq15hsojmevmizthcl">
+      <w:hyperlink w:history="1" r:id="rId5dvjx_jbou-66vl0tvndg">
         <w:r>
           <w:rPr>
             <w:rStyle w:val="Hyperlink"/>
@@ -60,7 +60,7 @@
         </w:rPr>
         <w:t xml:space="preserve">Source code: </w:t>
       </w:r>
-      <w:hyperlink w:history="1" r:id="rIdoo5fmzccayn3cxivejstj">
+      <w:hyperlink w:history="1" r:id="rIdq5r0xj4d2seg-zh0ciseg">
         <w:r>
           <w:rPr>
             <w:rStyle w:val="Hyperlink"/>
@@ -1071,7 +1071,7 @@
         <w:t xml:space="preserve">How it was iterated.</w:t>
       </w:r>
       <w:r>
-        <w:t xml:space="preserve"> All twenty-three quoted segments were re-checked against the authoritative PDF by string comparison, normalising for list markers and the hyphenation artefacts pdftotext introduces at line breaks. Nine substantive corrections followed: the euro placement in Article 7, four semicolons the paper does not contain, a condensed values list in Article 2 that was a paraphrase rather than a quote, a spliced pair of non-adjacent sentences in Article 6, and three places where words had been dropped mid-quotation without an elision marker. Nineteen of the twenty-three segments now match the paper character for character; the remaining four end early at a full stop, which is ordinary quoting practice. A feature whose entire claim is exact quotation cannot rest on an unverified transcription, and the error would not have surfaced without comparing against the submitted artefact rather than the convenient one.</w:t>
+        <w:t xml:space="preserve"> All twenty-three quoted segments were re-checked against the authoritative PDF by string comparison, normalising for list markers and the hyphenation artefacts pdftotext introduces at line breaks. Nine substantive corrections followed: the euro placement in Article 7, four semicolons the paper does not contain, a condensed values list in Article 2 that was a paraphrase rather than a quote, a spliced pair of non-adjacent sentences in Article 6, and three places where words had been dropped mid-quotation without an elision marker. Nineteen of the twenty-three segments now match the paper character for character; the remaining four end early at a full stop, which is ordinary quoting practice. The source document was then brought into line with the submitted version as well, which allowed a second verification pass against clean text rather than PDF extraction, free of page numbers, hyphenation artefacts and table reordering. That pass closed the last gaps: all twenty-three segments now reconcile, nineteen exactly and four truncated at a full stop. A feature whose entire claim is exact quotation cannot rest on an unverified transcription, and the error would not have surfaced without comparing against the submitted artefact rather than the convenient one.</w:t>
       </w:r>
     </w:p>
     <w:sectPr>

</xml_diff>